<commit_message>
Explicar en la guía por qué el empleado se asigna el ticket
Justificación de la cola compartida (el empleado elige, el sistema
ordena por prioridad y plazo) y el punto débil de que la cola no se
filtra por área, con la respuesta para la exposición.

Co-Authored-By: Claude Opus 5.5 <noreply@anthropic.com>
Claude-Session: https://claude.ai/code/session_014CXUi3wKp4VRTZG62Z1KLN
</commit_message>
<xml_diff>
--- a/Teoria/Guia_Tecnica_Sistema_Reclamos.docx
+++ b/Teoria/Guia_Tecnica_Sistema_Reclamos.docx
@@ -22420,6 +22420,344 @@
         <w:t xml:space="preserve">Inspeccionar: el protocolo PR-FUNC-01 del ticket TK-2026-0001.</w:t>
       </w:r>
     </w:p>
+    <w:p>
+      <w:pPr>
+        <w:pStyle w:val="Heading3"/>
+      </w:pPr>
+      <w:r>
+        <w:t xml:space="preserve">Por qué el empleado elige qué ticket tomar</w:t>
+      </w:r>
+    </w:p>
+    <w:p>
+      <w:pPr>
+        <w:spacing w:after="120"/>
+      </w:pPr>
+      <w:r>
+        <w:t xml:space="preserve">La asignación </w:t>
+      </w:r>
+      <w:r>
+        <w:rPr>
+          <w:b/>
+          <w:bCs/>
+        </w:rPr>
+        <w:t xml:space="preserve">no es automática</w:t>
+      </w:r>
+      <w:r>
+        <w:t xml:space="preserve">: el sistema no decide quién atiende. Los tickets sin responsable (Registrado o Impugnado) quedan en una </w:t>
+      </w:r>
+      <w:r>
+        <w:rPr>
+          <w:b/>
+          <w:bCs/>
+        </w:rPr>
+        <w:t xml:space="preserve">cola compartida</w:t>
+      </w:r>
+      <w:r>
+        <w:t xml:space="preserve"> y el empleado </w:t>
+      </w:r>
+      <w:r>
+        <w:rPr>
+          <w:b/>
+          <w:bCs/>
+        </w:rPr>
+        <w:t xml:space="preserve">se asigna</w:t>
+      </w:r>
+      <w:r>
+        <w:t xml:space="preserve"> el que va a atender. Es el modelo de las mesas de ayuda (cola "pull"). La justificación:</w:t>
+      </w:r>
+    </w:p>
+    <w:p>
+      <w:pPr>
+        <w:pStyle w:val="ListParagraph"/>
+        <w:numPr>
+          <w:ilvl w:val="0"/>
+          <w:numId w:val="4"/>
+        </w:numPr>
+        <w:spacing w:after="60"/>
+      </w:pPr>
+      <w:r>
+        <w:rPr>
+          <w:b/>
+          <w:bCs/>
+        </w:rPr>
+        <w:t xml:space="preserve">Solo una persona sabe si puede atenderlo ahora:</w:t>
+      </w:r>
+      <w:r>
+        <w:t xml:space="preserve"> el sistema no conoce la carga real de cada técnico, si está en otra reparación o si tiene el repuesto. Asignar a ciegas deja tickets esperando a alguien ocupado.</w:t>
+      </w:r>
+    </w:p>
+    <w:p>
+      <w:pPr>
+        <w:pStyle w:val="ListParagraph"/>
+        <w:numPr>
+          <w:ilvl w:val="0"/>
+          <w:numId w:val="4"/>
+        </w:numPr>
+        <w:spacing w:after="60"/>
+      </w:pPr>
+      <w:r>
+        <w:rPr>
+          <w:b/>
+          <w:bCs/>
+        </w:rPr>
+        <w:t xml:space="preserve">El orden lo pone el sistema, no el empleado:</w:t>
+      </w:r>
+      <w:r>
+        <w:t xml:space="preserve"> la cola muestra prioridad, límite y si está vencido. El empleado elige, pero con la información de qué urge.</w:t>
+      </w:r>
+    </w:p>
+    <w:p>
+      <w:pPr>
+        <w:pStyle w:val="ListParagraph"/>
+        <w:numPr>
+          <w:ilvl w:val="0"/>
+          <w:numId w:val="4"/>
+        </w:numPr>
+        <w:spacing w:after="60"/>
+      </w:pPr>
+      <w:r>
+        <w:rPr>
+          <w:b/>
+          <w:bCs/>
+        </w:rPr>
+        <w:t xml:space="preserve">Queda la responsabilidad registrada:</w:t>
+      </w:r>
+      <w:r>
+        <w:t xml:space="preserve"> al asignarse, el ticket guarda área, especialista y protocolo, y la bitácora anota quién lo tomó. Desde ahí nadie más lo ve.</w:t>
+      </w:r>
+    </w:p>
+    <w:p>
+      <w:pPr>
+        <w:pStyle w:val="ListParagraph"/>
+        <w:numPr>
+          <w:ilvl w:val="0"/>
+          <w:numId w:val="4"/>
+        </w:numPr>
+        <w:spacing w:after="60"/>
+      </w:pPr>
+      <w:r>
+        <w:rPr>
+          <w:b/>
+          <w:bCs/>
+        </w:rPr>
+        <w:t xml:space="preserve">Lo que sí es automático es lo que no depende de una persona:</w:t>
+      </w:r>
+      <w:r>
+        <w:t xml:space="preserve"> la prioridad, el plazo y el protocolo (este último sale del tipo de problema al asignarse).</w:t>
+      </w:r>
+    </w:p>
+    <w:tbl>
+      <w:tblPr>
+        <w:tblW w:type="dxa" w:w="9638"/>
+        <w:tblBorders>
+          <w:top w:val="single" w:color="BF9000" w:sz="6"/>
+          <w:left w:val="single" w:color="BF9000" w:sz="6"/>
+          <w:bottom w:val="single" w:color="BF9000" w:sz="6"/>
+          <w:right w:val="single" w:color="BF9000" w:sz="6"/>
+          <w:insideH w:val="single" w:color="BF9000" w:sz="6"/>
+          <w:insideV w:val="single" w:color="BF9000" w:sz="6"/>
+        </w:tblBorders>
+      </w:tblPr>
+      <w:tblGrid>
+        <w:gridCol w:w="9638"/>
+      </w:tblGrid>
+      <w:tr>
+        <w:tc>
+          <w:tcPr>
+            <w:tcW w:type="dxa" w:w="9638"/>
+            <w:shd w:fill="FCE4D6" w:color="auto" w:val="clear"/>
+            <w:tcMar>
+              <w:top w:type="dxa" w:w="100"/>
+              <w:left w:type="dxa" w:w="160"/>
+              <w:bottom w:type="dxa" w:w="100"/>
+              <w:right w:type="dxa" w:w="160"/>
+            </w:tcMar>
+          </w:tcPr>
+          <w:p>
+            <w:pPr>
+              <w:spacing w:after="60"/>
+            </w:pPr>
+            <w:r>
+              <w:rPr>
+                <w:b/>
+                <w:bCs/>
+                <w:color w:val="7F6000"/>
+              </w:rPr>
+              <w:t xml:space="preserve">Ojo</w:t>
+            </w:r>
+          </w:p>
+          <w:p>
+            <w:pPr>
+              <w:spacing w:after="60"/>
+            </w:pPr>
+            <w:r>
+              <w:rPr>
+                <w:b/>
+                <w:bCs/>
+                <w:sz w:val="20"/>
+                <w:szCs w:val="20"/>
+              </w:rPr>
+              <w:t xml:space="preserve">Punto débil que puede notar el profesor:</w:t>
+            </w:r>
+            <w:r>
+              <w:rPr>
+                <w:sz w:val="20"/>
+                <w:szCs w:val="20"/>
+              </w:rPr>
+              <w:t xml:space="preserve"> en el prototipo la cola compartida la ven </w:t>
+            </w:r>
+            <w:r>
+              <w:rPr>
+                <w:b/>
+                <w:bCs/>
+                <w:sz w:val="20"/>
+                <w:szCs w:val="20"/>
+              </w:rPr>
+              <w:t xml:space="preserve">todos los empleados, de cualquier área</w:t>
+            </w:r>
+            <w:r>
+              <w:rPr>
+                <w:sz w:val="20"/>
+                <w:szCs w:val="20"/>
+              </w:rPr>
+              <w:t xml:space="preserve">. E02 (Logística) podría asignarse un ticket de Funcionamiento, y el ticket quedaría con el área de E02.</w:t>
+            </w:r>
+          </w:p>
+          <w:p>
+            <w:pPr>
+              <w:spacing w:after="60"/>
+            </w:pPr>
+            <w:r>
+              <w:rPr>
+                <w:b/>
+                <w:bCs/>
+                <w:sz w:val="20"/>
+                <w:szCs w:val="20"/>
+              </w:rPr>
+              <w:t xml:space="preserve">Cómo responder:</w:t>
+            </w:r>
+            <w:r>
+              <w:rPr>
+                <w:sz w:val="20"/>
+                <w:szCs w:val="20"/>
+              </w:rPr>
+              <w:t xml:space="preserve"> en el sistema final la cola se filtraría por el </w:t>
+            </w:r>
+            <w:r>
+              <w:rPr>
+                <w:b/>
+                <w:bCs/>
+                <w:sz w:val="20"/>
+                <w:szCs w:val="20"/>
+              </w:rPr>
+              <w:t xml:space="preserve">área que corresponde al tipo de problema</w:t>
+            </w:r>
+            <w:r>
+              <w:rPr>
+                <w:sz w:val="20"/>
+                <w:szCs w:val="20"/>
+              </w:rPr>
+              <w:t xml:space="preserve"> (Funcionamiento → Área Técnica, Entrega → Logística, Cobranza → Ventas), así cada empleado solo ve los de su área. Y si un ticket cayó en el área equivocada, para eso existe en el catálogo el evento </w:t>
+            </w:r>
+            <w:r>
+              <w:rPr>
+                <w:b/>
+                <w:bCs/>
+                <w:sz w:val="20"/>
+                <w:szCs w:val="20"/>
+              </w:rPr>
+              <w:t xml:space="preserve">Reasignación de Área</w:t>
+            </w:r>
+            <w:r>
+              <w:rPr>
+                <w:sz w:val="20"/>
+                <w:szCs w:val="20"/>
+              </w:rPr>
+              <w:t xml:space="preserve"> (hoy deshabilitado).</w:t>
+            </w:r>
+          </w:p>
+        </w:tc>
+      </w:tr>
+    </w:tbl>
+    <w:p>
+      <w:pPr>
+        <w:spacing w:after="120"/>
+      </w:pPr>
+    </w:p>
+    <w:tbl>
+      <w:tblPr>
+        <w:tblW w:type="dxa" w:w="9638"/>
+        <w:tblBorders>
+          <w:top w:val="single" w:color="BF9000" w:sz="6"/>
+          <w:left w:val="single" w:color="BF9000" w:sz="6"/>
+          <w:bottom w:val="single" w:color="BF9000" w:sz="6"/>
+          <w:right w:val="single" w:color="BF9000" w:sz="6"/>
+          <w:insideH w:val="single" w:color="BF9000" w:sz="6"/>
+          <w:insideV w:val="single" w:color="BF9000" w:sz="6"/>
+        </w:tblBorders>
+      </w:tblPr>
+      <w:tblGrid>
+        <w:gridCol w:w="9638"/>
+      </w:tblGrid>
+      <w:tr>
+        <w:tc>
+          <w:tcPr>
+            <w:tcW w:type="dxa" w:w="9638"/>
+            <w:shd w:fill="FFF4CE" w:color="auto" w:val="clear"/>
+            <w:tcMar>
+              <w:top w:type="dxa" w:w="100"/>
+              <w:left w:type="dxa" w:w="160"/>
+              <w:bottom w:type="dxa" w:w="100"/>
+              <w:right w:type="dxa" w:w="160"/>
+            </w:tcMar>
+          </w:tcPr>
+          <w:p>
+            <w:pPr>
+              <w:spacing w:after="60"/>
+            </w:pPr>
+            <w:r>
+              <w:rPr>
+                <w:b/>
+                <w:bCs/>
+                <w:color w:val="7F6000"/>
+              </w:rPr>
+              <w:t xml:space="preserve">Lo que puede preguntar el profesor</w:t>
+            </w:r>
+          </w:p>
+          <w:p>
+            <w:pPr>
+              <w:spacing w:after="60"/>
+            </w:pPr>
+            <w:r>
+              <w:rPr>
+                <w:b/>
+                <w:bCs/>
+                <w:sz w:val="20"/>
+                <w:szCs w:val="20"/>
+              </w:rPr>
+              <w:t xml:space="preserve">P: ¿Por qué el empleado se asigna solo y no lo asigna el sistema?</w:t>
+            </w:r>
+          </w:p>
+          <w:p>
+            <w:pPr>
+              <w:spacing w:after="60"/>
+            </w:pPr>
+            <w:r>
+              <w:rPr>
+                <w:sz w:val="20"/>
+                <w:szCs w:val="20"/>
+              </w:rPr>
+              <w:t xml:space="preserve">R: Porque el que sabe si puede atenderlo en ese momento es el empleado. El sistema le ordena la cola con prioridad y plazo, y lo automático es lo que no depende de una persona: prioridad, plazo y protocolo. En el sistema final la cola se filtraría por el área del tipo de problema.</w:t>
+            </w:r>
+          </w:p>
+        </w:tc>
+      </w:tr>
+    </w:tbl>
+    <w:p>
+      <w:pPr>
+        <w:spacing w:after="120"/>
+      </w:pPr>
+    </w:p>
     <w:tbl>
       <w:tblPr>
         <w:tblW w:type="dxa" w:w="9638"/>
@@ -30703,6 +31041,26 @@
       </w:r>
       <w:r>
         <w:t xml:space="preserve"> satisfacción, costo y eficiencia necesitan datos que el sistema todavía no registra.</w:t>
+      </w:r>
+    </w:p>
+    <w:p>
+      <w:pPr>
+        <w:pStyle w:val="ListParagraph"/>
+        <w:numPr>
+          <w:ilvl w:val="0"/>
+          <w:numId w:val="4"/>
+        </w:numPr>
+        <w:spacing w:after="60"/>
+      </w:pPr>
+      <w:r>
+        <w:rPr>
+          <w:b/>
+          <w:bCs/>
+        </w:rPr>
+        <w:t xml:space="preserve">Cola compartida entre áreas:</w:t>
+      </w:r>
+      <w:r>
+        <w:t xml:space="preserve"> los tickets sin responsable los ve cualquier empleado, de cualquier área. En el sistema final se filtrarían por el área que corresponde al tipo de problema (sección 6.1).</w:t>
       </w:r>
     </w:p>
     <w:p>

</xml_diff>